<commit_message>
docs(capstone): actualiza guias oficiales fase 2 TASK-183
</commit_message>
<xml_diff>
--- a/Fase 2/Evidencias Grupales/2.4_GuiaEstudiante_Fase 2_DesarrolloProyecto APT.docx
+++ b/Fase 2/Evidencias Grupales/2.4_GuiaEstudiante_Fase 2_DesarrolloProyecto APT.docx
@@ -646,7 +646,7 @@
                 <w:szCs w:val="19"/>
                 <w:rtl w:val="0"/>
               </w:rPr>
-              <w:t xml:space="preserve">CitaJusta — Plataforma inteligente para recuperar citas canceladas y optimizar listas de espera. Actualización documental al 15 de octubre de 2026 (Fase 2, Capstone APT122). </w:t>
+              <w:t xml:space="preserve">CitaJusta — Plataforma inteligente para recuperar citas canceladas y optimizar listas de espera. Actualización documental al 17 de octubre de 2026 (Fase 2, Capstone APT122). </w:t>
             </w:r>
             <w:r>
               <w:rPr>
@@ -687,7 +687,7 @@
                 <w:szCs w:val="19"/>
                 <w:rtl w:val="0"/>
               </w:rPr>
-              <w:t xml:space="preserve">Se desarrolló una solución con backend NestJS/TypeScript, PostgreSQL/Prisma, aplicación Web React/Vite y aplicación institucional Desktop Tauri. Se implementaron gestión de usuarios y permisos, catálogos, agenda, reservas, cancelaciones, lista de espera, ofertas de reasignación y auditoría. En la demostración del 15-10-2026 se comprobó una reserva Web visible en Desktop, así como consultas de catálogos, agenda, asistencia, reportes, auditoría y un proceso histórico de reasignación.</w:t>
+              <w:t>Se desarrolló una solución con backend NestJS/TypeScript, PostgreSQL/Prisma 7.10.0, Web React/Vite y Desktop Tauri. Implementa usuarios y permisos, agenda, reservas, cancelaciones, lista de espera, reasignaciones y auditoría. La demostración del 15-10 confirmó reserva Web visible en Desktop y consultas institucionales. Al 17-10 se dispone además de Docker Compose de demostración (PR #176) y PostgreSQL 18 aislado para E2E (PR #179), sin acreditar despliegue productivo.</w:t>
             </w:r>
             <w:r>
               <w:rPr>
@@ -735,7 +735,7 @@
                 <w:szCs w:val="19"/>
                 <w:rtl w:val="0"/>
               </w:rPr>
-              <w:t xml:space="preserve">Integraciones existentes: correo Resend, Google OAuth, copia puntual a Google Calendar y visualización de ubicaciones mediante OpenStreetMap y enlaces Google Maps. Se validó manualmente la recepción real del correo HTML de reserva en Gmail el 15-10-2026. La versión visual V2 con logo CID obtuvo 611/611 tests de API PASS según reporte de Codex, y aún requiere verificación visual manual en Gmail. HU-043 (WhatsApp Cloud API) se excluyó formalmente del entregable el 15-10-2026 por restricciones del proveedor para el contexto académico; su retirada documental fue integrada en main.</w:t>
+              <w:t>Integraciones implementadas: correo Resend, Google OAuth, Google Calendar, mapas OpenStreetMap/Google Maps y consulta de feriados de Chile mediante Nager.Date. Resend V2 con logo CID se integró en main (PR #173); sigue pendiente comprobar recepción y visualización de esa versión en Gmail. La recepción del correo HTML comprobada el 15-10 corresponde al flujo anterior. La regresión de API de 611/611 para V2 se conserva como resultado histórico reportado por Codex. HU-043 (WhatsApp Cloud API) se excluyó del entregable el 15-10 por restricciones del proveedor.</w:t>
             </w:r>
             <w:r>
               <w:rPr>
@@ -905,7 +905,7 @@
                 <w:szCs w:val="18"/>
                 <w:rtl w:val="0"/>
               </w:rPr>
-              <w:t xml:space="preserve">Ajuste operativo: se estabilizó primero el núcleo transaccional de citas y reasignación, después las interfaces e integraciones. Se retiró WhatsApp del alcance del proyecto académico. La base local de desarrollo conserva una migración experimental de WhatsApp aplicada y pendiente de reconciliación segura; no se efectuaron operaciones destructivas.</w:t>
+              <w:t>Ajuste operativo: se estabilizó primero el núcleo transaccional de citas y reasignación y después las interfaces e integraciones. Se incorporó Docker de demostración y un PostgreSQL exclusivo para pruebas E2E para evitar operaciones sobre las bases de desarrollo y demostración. Se retiró WhatsApp del alcance. La base de desarrollo conserva una migración experimental de WhatsApp pendiente de reconciliación segura; no se realizaron operaciones destructivas.</w:t>
             </w:r>
             <w:r>
               <w:rPr>
@@ -1056,7 +1056,7 @@
                 <w:szCs w:val="18"/>
                 <w:rtl w:val="0"/>
               </w:rPr>
-              <w:t xml:space="preserve">• Código de las aplicaciones Web, Desktop y API, migraciones Prisma y pruebas: evidencian implementación y validación técnica.</w:t>
+              <w:t>• Código Web, Desktop y API, migraciones Prisma y Docker Compose (PR #176): implementación y demostración local; no acreditan producción.</w:t>
             </w:r>
             <w:r>
               <w:rPr>
@@ -1080,7 +1080,7 @@
                 <w:szCs w:val="18"/>
                 <w:rtl w:val="0"/>
               </w:rPr>
-              <w:t xml:space="preserve">• Issues/PR de HU-039 a HU-042 y resultados de pruebas: permiten revisar trazabilidad de integraciones cerradas.</w:t>
+              <w:t>• PR #173 (Resend V2), PR #179 (runner E2E) e integración de Nager.Date: trazabilidad de avances y límites conocidos.</w:t>
             </w:r>
             <w:r>
               <w:rPr>
@@ -1128,9 +1128,7 @@
                 <w:szCs w:val="18"/>
                 <w:rtl w:val="0"/>
               </w:rPr>
-              <w:t xml:space="preserve">• Prueba manual del 15-10-2026: reserva Web del 16-10 a las 13:00, correo HTML recibido en Gmail, agenda y asistencia consultadas en Desktop; reportes, auditoría y reasignación histórica consultados.</w:t>
-              <w:br w:type="textWrapping"/>
-              <w:t xml:space="preserve">Resguardo de calidad: TypeScript strict, RBAC, AuthorizationContext, aislamiento multi-tenant, transacciones, restricciones PostgreSQL y suites automatizadas. Regresión API del cambio V2: 611/611 PASS según Codex; E2E no se ejecutó sobre la base local alterada.</w:t>
+              <w:t>• Prueba manual del 15-10: reserva Web, correo HTML recibido en Gmail, cita visible desde Desktop y consultas de agenda, asistencia, reportes y auditoría. El 17-10 se ejecutaron 18 suites E2E sobre PostgreSQL 18 aislado: 237/237 PASS; auditoría 12/12 PASS. Pruebas unitarias del runner 24/24 PASS tras la corrección. Integraciones externas simuladas; el escenario histórico reassignment-demo no forma parte de las 18 suites. Se mantienen RBAC, aislamiento institucional y validaciones transaccionales como controles implementados, no como certificación de seguridad.</w:t>
             </w:r>
             <w:r>
               <w:rPr>
@@ -1237,6 +1235,7 @@
         </w:tblBorders>
         <w:tblLayout w:type="fixed"/>
         <w:tblLook w:val="0400"/>
+        <w:tblInd w:w="-964" w:type="dxa"/>
       </w:tblPr>
       <w:tblGrid>
         <w:gridCol w:w="1335"/>
@@ -3125,7 +3124,7 @@
                 <w:szCs w:val="16"/>
                 <w:rtl w:val="0"/>
               </w:rPr>
-              <w:t xml:space="preserve">Suites informadas PASS; falta recopilar evidencia de ejecución.</w:t>
+              <w:t>PostgreSQL 18 E2E aislado: 18 suites, 237/237 PASS; auditoría 12/12 y runner 24/24 PASS. Falta consolidar evidencia académica.</w:t>
             </w:r>
             <w:r>
               <w:rPr>
@@ -3180,7 +3179,7 @@
                 <w:szCs w:val="16"/>
                 <w:rtl w:val="0"/>
               </w:rPr>
-              <w:t xml:space="preserve">Reunir pruebas.</w:t>
+              <w:t>Adjuntar resultados sanitizados y trazabilidad PR #179; plan de seguridad/rendimiento pendiente.</w:t>
             </w:r>
             <w:r>
               <w:rPr>
@@ -3352,7 +3351,7 @@
                 <w:szCs w:val="16"/>
                 <w:rtl w:val="0"/>
               </w:rPr>
-              <w:t xml:space="preserve">Actualizar acta de Sprint Retrospective, Scrum y guías Fase 2; cerrar evidencias pendientes.</w:t>
+              <w:t>Matriz, inventario y checklist actualizados (PR #182); guías 2.4/2.6 y anexos Scrum aún requieren validación.</w:t>
             </w:r>
             <w:r>
               <w:rPr>
@@ -3405,7 +3404,7 @@
                 <w:szCs w:val="16"/>
                 <w:rtl w:val="0"/>
               </w:rPr>
-              <w:t xml:space="preserve">Completar registro formal de Sprints, criterios de avance y anexos.</w:t>
+              <w:t>Revisar guías y actas reales; verificar entregables con el docente.</w:t>
             </w:r>
             <w:r>
               <w:rPr>
@@ -3626,7 +3625,7 @@
                 <w:szCs w:val="19"/>
                 <w:rtl w:val="0"/>
               </w:rPr>
-              <w:t xml:space="preserve">Facilitadores: definición temprana del problema y alcance en Fase 1; existencia de un Product Backlog; arquitectura modular con API única para Web y Desktop; seguimiento con Issues, PR y Kanban; pruebas repetibles con PostgreSQL real.</w:t>
+              <w:t>Facilitadores: problema y alcance definidos en Fase 1; Product Backlog; API modular compartida por Web y Desktop; seguimiento mediante Issues, PR y Kanban; Docker Compose y ejecución E2E reproducible en PostgreSQL real aislado.</w:t>
             </w:r>
             <w:r>
               <w:rPr>
@@ -3651,7 +3650,7 @@
                 <w:szCs w:val="19"/>
                 <w:rtl w:val="0"/>
               </w:rPr>
-              <w:t xml:space="preserve">Dificultades: garantizar unicidad y trazabilidad ante concurrencia, coordinar la API con Web y Desktop, sincronizar documentos y ejecutar eventos Scrum con evidencia formal; bloqueo de WhatsApp Cloud API por restricciones de Meta (solucionado como cambio de alcance, no como integración entregada).</w:t>
+              <w:t>Dificultades: mantener integridad y trazabilidad bajo concurrencia, coordinar Web/Desktop con la API, documentar las evidencias Scrum y aislar las pruebas del entorno de desarrollo. WhatsApp Cloud API quedó excluida por restricciones de Meta (cambio de alcance, no integración entregada).</w:t>
             </w:r>
             <w:r>
               <w:rPr>
@@ -3777,7 +3776,7 @@
                 <w:szCs w:val="18"/>
                 <w:rtl w:val="0"/>
               </w:rPr>
-              <w:t xml:space="preserve">Las integraciones externas no deben alterar el estado de citas si el proveedor falla. Se conservaron Resend, Google OAuth, Google Calendar y OpenStreetMap/Google Maps. Nager.Date se encuentra propuesto para evaluación posterior y no se considera implementado.</w:t>
+              <w:t>Las integraciones externas no deben alterar citas ante fallos del proveedor. Se conservaron Resend, Google OAuth, Google Calendar y OpenStreetMap/Google Maps; la consulta de feriados Chile con Nager.Date se implementó y fusionó. Resend V2 se fusionó (PR #173), pero su recepción y renderizado real con logo CID aún no están acreditados.</w:t>
             </w:r>
             <w:r>
               <w:rPr>
@@ -3885,7 +3884,7 @@
                 <w:szCs w:val="18"/>
                 <w:rtl w:val="0"/>
               </w:rPr>
-              <w:t xml:space="preserve">Pendientes al corte 15-10-2026: completar evidencias y documentos académicos de Fase 2; consolidar Sprint Backlogs, actas y retrospectivas; verificar UML, ER, mockups y requisitos; preparar y validar despliegue Docker; probar manualmente el logo CID de la nueva plantilla Resend; definir porcentaje global de avance con criterios y evidencias; acordar reconciliación de migración local experimental.</w:t>
+              <w:t>Pendientes al corte 17-10-2026: validar guías 2.4/2.6 y anexos Scrum; revisar UML, ER, mockups y requisitos; consolidar evidencia académica Docker demo/E2E ya validados; verificar recepción de Resend V2 con logo CID; definir métricas de avance y resultados de rendimiento/seguridad; confirmar criterio docente de cinco APIs/dos propias; documentar normalización y conteo físico de tablas; acordar reconciliación segura de migración local experimental. Despliegue productivo no acreditado.</w:t>
             </w:r>
             <w:r>
               <w:rPr>
@@ -3906,7 +3905,7 @@
                 <w:szCs w:val="18"/>
                 <w:rtl w:val="0"/>
               </w:rPr>
-              <w:t xml:space="preserve">Estrategia: priorizar los entregables oficiales, actualizar las guías 2.4/2.6 sin perder el formato base, registrar retrospectiva y acuerdos reales con el docente, separar pruebas técnicas de evidencia académica y no atribuir funciones futuras como terminadas.</w:t>
+              <w:t>Estrategia: priorizar entregables oficiales sin alterar plantillas; mantener trazabilidad de PR #173, #176, #179 y #182, de reuniones reales y de las decisiones del equipo. Separar pruebas técnicas confirmadas de aprobación académica; no declarar servicios externos simulados como integraciones E2E reales ni trabajo futuro como terminado.</w:t>
             </w:r>
             <w:r>
               <w:rPr>

</xml_diff>